<commit_message>
Band 4: Kapitelkoepfe im Manuskript (Muster A -- Sink, Versalien, mehr Luft)
- Sink ~2,5 cm ueber echten Leerraum-Absatz (space_before am Seitenanfang
  wird von Word verworfen, deshalb ein leerer Absatz)
- Kapitelnummer als gesperrte graue Versalien: "KAPITEL 12" statt "Kapitel 12"
  (Sperrung 2,6 pt, Grau #5A5A5A), Epilog: "EPILOG"
- Kapiteltitel 17 pt (statt 14), 22 pt Luft nach unten (statt 10)
- Heading-Ebenen 1/2 bleiben erhalten (eBook-Navigation intakt)

Co-Authored-By: Claude Opus 4.8 <noreply@anthropic.com>
</commit_message>
<xml_diff>
--- a/Band_4/Linear/Manuskript.docx
+++ b/Band_4/Linear/Manuskript.docx
@@ -636,7 +636,7 @@
     </w:p>
     <w:p>
       <w:pPr>
-        <w:spacing w:after="200"/>
+        <w:spacing w:before="0" w:after="1120"/>
       </w:pPr>
     </w:p>
     <w:p>
@@ -644,18 +644,21 @@
         <w:pStyle w:val="Heading2"/>
       </w:pPr>
       <w:r>
-        <w:t>Kapitel 1</w:t>
-      </w:r>
-    </w:p>
-    <w:p>
-      <w:bookmarkStart w:id="24642" w:name="kapitel_1"/>
+        <w:rPr>
+          <w:spacing w:val="52"/>
+        </w:rPr>
+        <w:t>KAPITEL 1</w:t>
+      </w:r>
+    </w:p>
+    <w:p>
+      <w:bookmarkStart w:id="51611" w:name="kapitel_1"/>
       <w:pPr>
         <w:pStyle w:val="Heading1"/>
       </w:pPr>
       <w:r>
         <w:t>Der Brief</w:t>
       </w:r>
-      <w:bookmarkEnd w:id="24642"/>
+      <w:bookmarkEnd w:id="51611"/>
     </w:p>
     <w:p>
       <w:pPr>
@@ -1949,7 +1952,7 @@
     </w:p>
     <w:p>
       <w:pPr>
-        <w:spacing w:after="200"/>
+        <w:spacing w:before="0" w:after="1120"/>
       </w:pPr>
     </w:p>
     <w:p>
@@ -1957,18 +1960,21 @@
         <w:pStyle w:val="Heading2"/>
       </w:pPr>
       <w:r>
-        <w:t>Kapitel 2</w:t>
-      </w:r>
-    </w:p>
-    <w:p>
-      <w:bookmarkStart w:id="909" w:name="kapitel_2"/>
+        <w:rPr>
+          <w:spacing w:val="52"/>
+        </w:rPr>
+        <w:t>KAPITEL 2</w:t>
+      </w:r>
+    </w:p>
+    <w:p>
+      <w:bookmarkStart w:id="43624" w:name="kapitel_2"/>
       <w:pPr>
         <w:pStyle w:val="Heading1"/>
       </w:pPr>
       <w:r>
         <w:t>Der Mann, der vierzig Jahre gesucht hat</w:t>
       </w:r>
-      <w:bookmarkEnd w:id="909"/>
+      <w:bookmarkEnd w:id="43624"/>
     </w:p>
     <w:p>
       <w:pPr>
@@ -2993,7 +2999,7 @@
     </w:p>
     <w:p>
       <w:pPr>
-        <w:spacing w:after="200"/>
+        <w:spacing w:before="0" w:after="1120"/>
       </w:pPr>
     </w:p>
     <w:p>
@@ -3001,18 +3007,21 @@
         <w:pStyle w:val="Heading2"/>
       </w:pPr>
       <w:r>
-        <w:t>Kapitel 3</w:t>
-      </w:r>
-    </w:p>
-    <w:p>
-      <w:bookmarkStart w:id="12445" w:name="kapitel_3"/>
+        <w:rPr>
+          <w:spacing w:val="52"/>
+        </w:rPr>
+        <w:t>KAPITEL 3</w:t>
+      </w:r>
+    </w:p>
+    <w:p>
+      <w:bookmarkStart w:id="66852" w:name="kapitel_3"/>
       <w:pPr>
         <w:pStyle w:val="Heading1"/>
       </w:pPr>
       <w:r>
         <w:t>Der Graue See</w:t>
       </w:r>
-      <w:bookmarkEnd w:id="12445"/>
+      <w:bookmarkEnd w:id="66852"/>
     </w:p>
     <w:p>
       <w:pPr>
@@ -4343,7 +4352,7 @@
     </w:p>
     <w:p>
       <w:pPr>
-        <w:spacing w:after="200"/>
+        <w:spacing w:before="0" w:after="1120"/>
       </w:pPr>
     </w:p>
     <w:p>
@@ -4351,18 +4360,21 @@
         <w:pStyle w:val="Heading2"/>
       </w:pPr>
       <w:r>
-        <w:t>Kapitel 4</w:t>
-      </w:r>
-    </w:p>
-    <w:p>
-      <w:bookmarkStart w:id="25228" w:name="kapitel_4"/>
+        <w:rPr>
+          <w:spacing w:val="52"/>
+        </w:rPr>
+        <w:t>KAPITEL 4</w:t>
+      </w:r>
+    </w:p>
+    <w:p>
+      <w:bookmarkStart w:id="97050" w:name="kapitel_4"/>
       <w:pPr>
         <w:pStyle w:val="Heading1"/>
       </w:pPr>
       <w:r>
         <w:t>Die erste Regel am See</w:t>
       </w:r>
-      <w:bookmarkEnd w:id="25228"/>
+      <w:bookmarkEnd w:id="97050"/>
     </w:p>
     <w:p>
       <w:pPr>
@@ -5827,7 +5839,7 @@
     </w:p>
     <w:p>
       <w:pPr>
-        <w:spacing w:after="200"/>
+        <w:spacing w:before="0" w:after="1120"/>
       </w:pPr>
     </w:p>
     <w:p>
@@ -5835,18 +5847,21 @@
         <w:pStyle w:val="Heading2"/>
       </w:pPr>
       <w:r>
-        <w:t>Kapitel 5</w:t>
-      </w:r>
-    </w:p>
-    <w:p>
-      <w:bookmarkStart w:id="73985" w:name="kapitel_5"/>
+        <w:rPr>
+          <w:spacing w:val="52"/>
+        </w:rPr>
+        <w:t>KAPITEL 5</w:t>
+      </w:r>
+    </w:p>
+    <w:p>
+      <w:bookmarkStart w:id="80451" w:name="kapitel_5"/>
       <w:pPr>
         <w:pStyle w:val="Heading1"/>
       </w:pPr>
       <w:r>
         <w:t>Drei Wellen und ein Stern</w:t>
       </w:r>
-      <w:bookmarkEnd w:id="73985"/>
+      <w:bookmarkEnd w:id="80451"/>
     </w:p>
     <w:p>
       <w:pPr>
@@ -6946,7 +6961,7 @@
     </w:p>
     <w:p>
       <w:pPr>
-        <w:spacing w:after="200"/>
+        <w:spacing w:before="0" w:after="1120"/>
       </w:pPr>
     </w:p>
     <w:p>
@@ -6954,18 +6969,21 @@
         <w:pStyle w:val="Heading2"/>
       </w:pPr>
       <w:r>
-        <w:t>Kapitel 6</w:t>
-      </w:r>
-    </w:p>
-    <w:p>
-      <w:bookmarkStart w:id="60097" w:name="kapitel_6"/>
+        <w:rPr>
+          <w:spacing w:val="52"/>
+        </w:rPr>
+        <w:t>KAPITEL 6</w:t>
+      </w:r>
+    </w:p>
+    <w:p>
+      <w:bookmarkStart w:id="26011" w:name="kapitel_6"/>
       <w:pPr>
         <w:pStyle w:val="Heading1"/>
       </w:pPr>
       <w:r>
         <w:t>Die Frau, die die Geschichte hütet</w:t>
       </w:r>
-      <w:bookmarkEnd w:id="60097"/>
+      <w:bookmarkEnd w:id="26011"/>
     </w:p>
     <w:p>
       <w:pPr>
@@ -8191,7 +8209,7 @@
     </w:p>
     <w:p>
       <w:pPr>
-        <w:spacing w:after="200"/>
+        <w:spacing w:before="0" w:after="1120"/>
       </w:pPr>
     </w:p>
     <w:p>
@@ -8199,18 +8217,21 @@
         <w:pStyle w:val="Heading2"/>
       </w:pPr>
       <w:r>
-        <w:t>Kapitel 7</w:t>
-      </w:r>
-    </w:p>
-    <w:p>
-      <w:bookmarkStart w:id="40876" w:name="kapitel_7"/>
+        <w:rPr>
+          <w:spacing w:val="52"/>
+        </w:rPr>
+        <w:t>KAPITEL 7</w:t>
+      </w:r>
+    </w:p>
+    <w:p>
+      <w:bookmarkStart w:id="75529" w:name="kapitel_7"/>
       <w:pPr>
         <w:pStyle w:val="Heading1"/>
       </w:pPr>
       <w:r>
         <w:t>Der Weg über den Hang</w:t>
       </w:r>
-      <w:bookmarkEnd w:id="40876"/>
+      <w:bookmarkEnd w:id="75529"/>
     </w:p>
     <w:p>
       <w:pPr>
@@ -9171,7 +9192,7 @@
     </w:p>
     <w:p>
       <w:pPr>
-        <w:spacing w:after="200"/>
+        <w:spacing w:before="0" w:after="1120"/>
       </w:pPr>
     </w:p>
     <w:p>
@@ -9179,18 +9200,21 @@
         <w:pStyle w:val="Heading2"/>
       </w:pPr>
       <w:r>
-        <w:t>Kapitel 8</w:t>
-      </w:r>
-    </w:p>
-    <w:p>
-      <w:bookmarkStart w:id="63277" w:name="kapitel_8"/>
+        <w:rPr>
+          <w:spacing w:val="52"/>
+        </w:rPr>
+        <w:t>KAPITEL 8</w:t>
+      </w:r>
+    </w:p>
+    <w:p>
+      <w:bookmarkStart w:id="29979" w:name="kapitel_8"/>
       <w:pPr>
         <w:pStyle w:val="Heading1"/>
       </w:pPr>
       <w:r>
         <w:t>Vier Häuser</w:t>
       </w:r>
-      <w:bookmarkEnd w:id="63277"/>
+      <w:bookmarkEnd w:id="29979"/>
     </w:p>
     <w:p>
       <w:pPr>
@@ -10162,7 +10186,7 @@
     </w:p>
     <w:p>
       <w:pPr>
-        <w:spacing w:after="200"/>
+        <w:spacing w:before="0" w:after="1120"/>
       </w:pPr>
     </w:p>
     <w:p>
@@ -10170,18 +10194,21 @@
         <w:pStyle w:val="Heading2"/>
       </w:pPr>
       <w:r>
-        <w:t>Kapitel 9</w:t>
-      </w:r>
-    </w:p>
-    <w:p>
-      <w:bookmarkStart w:id="65298" w:name="kapitel_9"/>
+        <w:rPr>
+          <w:spacing w:val="52"/>
+        </w:rPr>
+        <w:t>KAPITEL 9</w:t>
+      </w:r>
+    </w:p>
+    <w:p>
+      <w:bookmarkStart w:id="13743" w:name="kapitel_9"/>
       <w:pPr>
         <w:pStyle w:val="Heading1"/>
       </w:pPr>
       <w:r>
         <w:t>Die, die geblieben ist</w:t>
       </w:r>
-      <w:bookmarkEnd w:id="65298"/>
+      <w:bookmarkEnd w:id="13743"/>
     </w:p>
     <w:p>
       <w:pPr>
@@ -11467,7 +11494,7 @@
     </w:p>
     <w:p>
       <w:pPr>
-        <w:spacing w:after="200"/>
+        <w:spacing w:before="0" w:after="1120"/>
       </w:pPr>
     </w:p>
     <w:p>
@@ -11475,18 +11502,21 @@
         <w:pStyle w:val="Heading2"/>
       </w:pPr>
       <w:r>
-        <w:t>Kapitel 10</w:t>
-      </w:r>
-    </w:p>
-    <w:p>
-      <w:bookmarkStart w:id="22318" w:name="kapitel_10"/>
+        <w:rPr>
+          <w:spacing w:val="52"/>
+        </w:rPr>
+        <w:t>KAPITEL 10</w:t>
+      </w:r>
+    </w:p>
+    <w:p>
+      <w:bookmarkStart w:id="89521" w:name="kapitel_10"/>
       <w:pPr>
         <w:pStyle w:val="Heading1"/>
       </w:pPr>
       <w:r>
         <w:t>Waffenstillstand</w:t>
       </w:r>
-      <w:bookmarkEnd w:id="22318"/>
+      <w:bookmarkEnd w:id="89521"/>
     </w:p>
     <w:p>
       <w:pPr>
@@ -12610,7 +12640,7 @@
     </w:p>
     <w:p>
       <w:pPr>
-        <w:spacing w:after="200"/>
+        <w:spacing w:before="0" w:after="1120"/>
       </w:pPr>
     </w:p>
     <w:p>
@@ -12618,18 +12648,21 @@
         <w:pStyle w:val="Heading2"/>
       </w:pPr>
       <w:r>
-        <w:t>Kapitel 11</w:t>
-      </w:r>
-    </w:p>
-    <w:p>
-      <w:bookmarkStart w:id="67198" w:name="kapitel_11"/>
+        <w:rPr>
+          <w:spacing w:val="52"/>
+        </w:rPr>
+        <w:t>KAPITEL 11</w:t>
+      </w:r>
+    </w:p>
+    <w:p>
+      <w:bookmarkStart w:id="7427" w:name="kapitel_11"/>
       <w:pPr>
         <w:pStyle w:val="Heading1"/>
       </w:pPr>
       <w:r>
         <w:t>Das fünfte Haus</w:t>
       </w:r>
-      <w:bookmarkEnd w:id="67198"/>
+      <w:bookmarkEnd w:id="7427"/>
     </w:p>
     <w:p>
       <w:pPr>
@@ -13678,7 +13711,7 @@
     </w:p>
     <w:p>
       <w:pPr>
-        <w:spacing w:after="200"/>
+        <w:spacing w:before="0" w:after="1120"/>
       </w:pPr>
     </w:p>
     <w:p>
@@ -13686,18 +13719,21 @@
         <w:pStyle w:val="Heading2"/>
       </w:pPr>
       <w:r>
-        <w:t>Kapitel 12</w:t>
-      </w:r>
-    </w:p>
-    <w:p>
-      <w:bookmarkStart w:id="17542" w:name="kapitel_12"/>
+        <w:rPr>
+          <w:spacing w:val="52"/>
+        </w:rPr>
+        <w:t>KAPITEL 12</w:t>
+      </w:r>
+    </w:p>
+    <w:p>
+      <w:bookmarkStart w:id="30764" w:name="kapitel_12"/>
       <w:pPr>
         <w:pStyle w:val="Heading1"/>
       </w:pPr>
       <w:r>
         <w:t>Das Andenken</w:t>
       </w:r>
-      <w:bookmarkEnd w:id="17542"/>
+      <w:bookmarkEnd w:id="30764"/>
     </w:p>
     <w:p>
       <w:pPr>
@@ -14840,7 +14876,7 @@
     </w:p>
     <w:p>
       <w:pPr>
-        <w:spacing w:after="200"/>
+        <w:spacing w:before="0" w:after="1120"/>
       </w:pPr>
     </w:p>
     <w:p>
@@ -14848,18 +14884,21 @@
         <w:pStyle w:val="Heading2"/>
       </w:pPr>
       <w:r>
-        <w:t>Kapitel 13</w:t>
-      </w:r>
-    </w:p>
-    <w:p>
-      <w:bookmarkStart w:id="29493" w:name="kapitel_13"/>
+        <w:rPr>
+          <w:spacing w:val="52"/>
+        </w:rPr>
+        <w:t>KAPITEL 13</w:t>
+      </w:r>
+    </w:p>
+    <w:p>
+      <w:bookmarkStart w:id="49215" w:name="kapitel_13"/>
       <w:pPr>
         <w:pStyle w:val="Heading1"/>
       </w:pPr>
       <w:r>
         <w:t>Was ein Pfand ist</w:t>
       </w:r>
-      <w:bookmarkEnd w:id="29493"/>
+      <w:bookmarkEnd w:id="49215"/>
     </w:p>
     <w:p>
       <w:pPr>
@@ -16353,7 +16392,7 @@
     </w:p>
     <w:p>
       <w:pPr>
-        <w:spacing w:after="200"/>
+        <w:spacing w:before="0" w:after="1120"/>
       </w:pPr>
     </w:p>
     <w:p>
@@ -16361,18 +16400,21 @@
         <w:pStyle w:val="Heading2"/>
       </w:pPr>
       <w:r>
-        <w:t>Kapitel 14</w:t>
-      </w:r>
-    </w:p>
-    <w:p>
-      <w:bookmarkStart w:id="2797" w:name="kapitel_14"/>
+        <w:rPr>
+          <w:spacing w:val="52"/>
+        </w:rPr>
+        <w:t>KAPITEL 14</w:t>
+      </w:r>
+    </w:p>
+    <w:p>
+      <w:bookmarkStart w:id="4534" w:name="kapitel_14"/>
       <w:pPr>
         <w:pStyle w:val="Heading1"/>
       </w:pPr>
       <w:r>
         <w:t>Die Mühle</w:t>
       </w:r>
-      <w:bookmarkEnd w:id="2797"/>
+      <w:bookmarkEnd w:id="4534"/>
     </w:p>
     <w:p>
       <w:pPr>
@@ -17628,7 +17670,7 @@
     </w:p>
     <w:p>
       <w:pPr>
-        <w:spacing w:after="200"/>
+        <w:spacing w:before="0" w:after="1120"/>
       </w:pPr>
     </w:p>
     <w:p>
@@ -17636,18 +17678,21 @@
         <w:pStyle w:val="Heading2"/>
       </w:pPr>
       <w:r>
-        <w:t>Kapitel 15</w:t>
-      </w:r>
-    </w:p>
-    <w:p>
-      <w:bookmarkStart w:id="32512" w:name="kapitel_15"/>
+        <w:rPr>
+          <w:spacing w:val="52"/>
+        </w:rPr>
+        <w:t>KAPITEL 15</w:t>
+      </w:r>
+    </w:p>
+    <w:p>
+      <w:bookmarkStart w:id="6603" w:name="kapitel_15"/>
       <w:pPr>
         <w:pStyle w:val="Heading1"/>
       </w:pPr>
       <w:r>
         <w:t>Was Nele wusste</w:t>
       </w:r>
-      <w:bookmarkEnd w:id="32512"/>
+      <w:bookmarkEnd w:id="6603"/>
     </w:p>
     <w:p>
       <w:pPr>
@@ -18860,7 +18905,7 @@
     </w:p>
     <w:p>
       <w:pPr>
-        <w:spacing w:after="200"/>
+        <w:spacing w:before="0" w:after="1120"/>
       </w:pPr>
     </w:p>
     <w:p>
@@ -18868,18 +18913,21 @@
         <w:pStyle w:val="Heading2"/>
       </w:pPr>
       <w:r>
-        <w:t>Kapitel 16</w:t>
-      </w:r>
-    </w:p>
-    <w:p>
-      <w:bookmarkStart w:id="26241" w:name="kapitel_16"/>
+        <w:rPr>
+          <w:spacing w:val="52"/>
+        </w:rPr>
+        <w:t>KAPITEL 16</w:t>
+      </w:r>
+    </w:p>
+    <w:p>
+      <w:bookmarkStart w:id="78438" w:name="kapitel_16"/>
       <w:pPr>
         <w:pStyle w:val="Heading1"/>
       </w:pPr>
       <w:r>
         <w:t>Die Namen auf den Steinen</w:t>
       </w:r>
-      <w:bookmarkEnd w:id="26241"/>
+      <w:bookmarkEnd w:id="78438"/>
     </w:p>
     <w:p>
       <w:pPr>
@@ -20190,7 +20238,7 @@
     </w:p>
     <w:p>
       <w:pPr>
-        <w:spacing w:after="200"/>
+        <w:spacing w:before="0" w:after="1120"/>
       </w:pPr>
     </w:p>
     <w:p>
@@ -20198,18 +20246,21 @@
         <w:pStyle w:val="Heading2"/>
       </w:pPr>
       <w:r>
-        <w:t>Kapitel 17</w:t>
-      </w:r>
-    </w:p>
-    <w:p>
-      <w:bookmarkStart w:id="33042" w:name="kapitel_17"/>
+        <w:rPr>
+          <w:spacing w:val="52"/>
+        </w:rPr>
+        <w:t>KAPITEL 17</w:t>
+      </w:r>
+    </w:p>
+    <w:p>
+      <w:bookmarkStart w:id="97904" w:name="kapitel_17"/>
       <w:pPr>
         <w:pStyle w:val="Heading1"/>
       </w:pPr>
       <w:r>
         <w:t>Der Stein</w:t>
       </w:r>
-      <w:bookmarkEnd w:id="33042"/>
+      <w:bookmarkEnd w:id="97904"/>
     </w:p>
     <w:p>
       <w:pPr>
@@ -21948,7 +21999,7 @@
     </w:p>
     <w:p>
       <w:pPr>
-        <w:spacing w:after="200"/>
+        <w:spacing w:before="0" w:after="1120"/>
       </w:pPr>
     </w:p>
     <w:p>
@@ -21956,18 +22007,21 @@
         <w:pStyle w:val="Heading2"/>
       </w:pPr>
       <w:r>
-        <w:t>Kapitel 18</w:t>
-      </w:r>
-    </w:p>
-    <w:p>
-      <w:bookmarkStart w:id="92608" w:name="kapitel_18"/>
+        <w:rPr>
+          <w:spacing w:val="52"/>
+        </w:rPr>
+        <w:t>KAPITEL 18</w:t>
+      </w:r>
+    </w:p>
+    <w:p>
+      <w:bookmarkStart w:id="2326" w:name="kapitel_18"/>
       <w:pPr>
         <w:pStyle w:val="Heading1"/>
       </w:pPr>
       <w:r>
         <w:t>Was man zurückgibt</w:t>
       </w:r>
-      <w:bookmarkEnd w:id="92608"/>
+      <w:bookmarkEnd w:id="2326"/>
     </w:p>
     <w:p>
       <w:pPr>
@@ -23628,7 +23682,7 @@
     </w:p>
     <w:p>
       <w:pPr>
-        <w:spacing w:after="200"/>
+        <w:spacing w:before="0" w:after="1120"/>
       </w:pPr>
     </w:p>
     <w:p>
@@ -23636,18 +23690,21 @@
         <w:pStyle w:val="Heading2"/>
       </w:pPr>
       <w:r>
-        <w:t>Epilog</w:t>
-      </w:r>
-    </w:p>
-    <w:p>
-      <w:bookmarkStart w:id="98092" w:name="kapitel_19"/>
+        <w:rPr>
+          <w:spacing w:val="52"/>
+        </w:rPr>
+        <w:t>EPILOG</w:t>
+      </w:r>
+    </w:p>
+    <w:p>
+      <w:bookmarkStart w:id="8961" w:name="kapitel_19"/>
       <w:pPr>
         <w:pStyle w:val="Heading1"/>
       </w:pPr>
       <w:r>
         <w:t>Zurück in Eichenhain</w:t>
       </w:r>
-      <w:bookmarkEnd w:id="98092"/>
+      <w:bookmarkEnd w:id="8961"/>
     </w:p>
     <w:p>
       <w:pPr>
@@ -26470,7 +26527,7 @@
       <w:keepNext/>
       <w:keepLines/>
       <w:pageBreakBefore w:val="0"/>
-      <w:spacing w:before="0" w:after="200"/>
+      <w:spacing w:before="0" w:after="440"/>
       <w:jc w:val="center"/>
       <w:outlineLvl w:val="0"/>
     </w:pPr>
@@ -26479,7 +26536,7 @@
       <w:b/>
       <w:bCs/>
       <w:color w:val="000000"/>
-      <w:sz w:val="28"/>
+      <w:sz w:val="34"/>
       <w:szCs w:val="28"/>
     </w:rPr>
   </w:style>
@@ -26495,7 +26552,7 @@
     <w:pPr>
       <w:keepNext/>
       <w:keepLines/>
-      <w:spacing w:before="0" w:after="40"/>
+      <w:spacing w:before="0" w:after="280"/>
       <w:jc w:val="center"/>
       <w:outlineLvl w:val="1"/>
     </w:pPr>
@@ -26503,7 +26560,7 @@
       <w:rFonts w:asciiTheme="majorHAnsi" w:eastAsiaTheme="majorEastAsia" w:hAnsiTheme="majorHAnsi" w:cstheme="majorBidi" w:ascii="Georgia" w:hAnsi="Georgia"/>
       <w:b w:val="0"/>
       <w:bCs/>
-      <w:color w:val="646464"/>
+      <w:color w:val="5A5A5A"/>
       <w:sz w:val="22"/>
       <w:szCs w:val="26"/>
     </w:rPr>

</xml_diff>

<commit_message>
Band 4: Rezensions-QR-Code (ASIN B0HBWVMTS2) erzeugt + im Manuskript verifiziert
Co-Authored-By: Claude Opus 4.8 <noreply@anthropic.com>
</commit_message>
<xml_diff>
--- a/Band_4/Linear/Manuskript.docx
+++ b/Band_4/Linear/Manuskript.docx
@@ -619,14 +619,14 @@
       </w:r>
     </w:p>
     <w:p>
-      <w:bookmarkStart w:id="3443" w:name="kapitel_1"/>
+      <w:bookmarkStart w:id="8979" w:name="kapitel_1"/>
       <w:pPr>
         <w:pStyle w:val="Heading1"/>
       </w:pPr>
       <w:r>
         <w:t>Der Brief</w:t>
       </w:r>
-      <w:bookmarkEnd w:id="3443"/>
+      <w:bookmarkEnd w:id="8979"/>
     </w:p>
     <w:p>
       <w:pPr>
@@ -1935,14 +1935,14 @@
       </w:r>
     </w:p>
     <w:p>
-      <w:bookmarkStart w:id="66988" w:name="kapitel_2"/>
+      <w:bookmarkStart w:id="60086" w:name="kapitel_2"/>
       <w:pPr>
         <w:pStyle w:val="Heading1"/>
       </w:pPr>
       <w:r>
         <w:t>Der Mann, der vierzig Jahre gesucht hat</w:t>
       </w:r>
-      <w:bookmarkEnd w:id="66988"/>
+      <w:bookmarkEnd w:id="60086"/>
     </w:p>
     <w:p>
       <w:pPr>
@@ -2982,14 +2982,14 @@
       </w:r>
     </w:p>
     <w:p>
-      <w:bookmarkStart w:id="16266" w:name="kapitel_3"/>
+      <w:bookmarkStart w:id="64523" w:name="kapitel_3"/>
       <w:pPr>
         <w:pStyle w:val="Heading1"/>
       </w:pPr>
       <w:r>
         <w:t>Der Graue See</w:t>
       </w:r>
-      <w:bookmarkEnd w:id="16266"/>
+      <w:bookmarkEnd w:id="64523"/>
     </w:p>
     <w:p>
       <w:pPr>
@@ -4335,14 +4335,14 @@
       </w:r>
     </w:p>
     <w:p>
-      <w:bookmarkStart w:id="4434" w:name="kapitel_4"/>
+      <w:bookmarkStart w:id="61829" w:name="kapitel_4"/>
       <w:pPr>
         <w:pStyle w:val="Heading1"/>
       </w:pPr>
       <w:r>
         <w:t>Die erste Regel am See</w:t>
       </w:r>
-      <w:bookmarkEnd w:id="4434"/>
+      <w:bookmarkEnd w:id="61829"/>
     </w:p>
     <w:p>
       <w:pPr>
@@ -5822,14 +5822,14 @@
       </w:r>
     </w:p>
     <w:p>
-      <w:bookmarkStart w:id="17443" w:name="kapitel_5"/>
+      <w:bookmarkStart w:id="61081" w:name="kapitel_5"/>
       <w:pPr>
         <w:pStyle w:val="Heading1"/>
       </w:pPr>
       <w:r>
         <w:t>Drei Wellen und ein Stern</w:t>
       </w:r>
-      <w:bookmarkEnd w:id="17443"/>
+      <w:bookmarkEnd w:id="61081"/>
     </w:p>
     <w:p>
       <w:pPr>
@@ -6944,14 +6944,14 @@
       </w:r>
     </w:p>
     <w:p>
-      <w:bookmarkStart w:id="53605" w:name="kapitel_6"/>
+      <w:bookmarkStart w:id="35320" w:name="kapitel_6"/>
       <w:pPr>
         <w:pStyle w:val="Heading1"/>
       </w:pPr>
       <w:r>
         <w:t>Die Frau, die die Geschichte hütet</w:t>
       </w:r>
-      <w:bookmarkEnd w:id="53605"/>
+      <w:bookmarkEnd w:id="35320"/>
     </w:p>
     <w:p>
       <w:pPr>
@@ -8192,14 +8192,14 @@
       </w:r>
     </w:p>
     <w:p>
-      <w:bookmarkStart w:id="76950" w:name="kapitel_7"/>
+      <w:bookmarkStart w:id="17738" w:name="kapitel_7"/>
       <w:pPr>
         <w:pStyle w:val="Heading1"/>
       </w:pPr>
       <w:r>
         <w:t>Der Weg über den Hang</w:t>
       </w:r>
-      <w:bookmarkEnd w:id="76950"/>
+      <w:bookmarkEnd w:id="17738"/>
     </w:p>
     <w:p>
       <w:pPr>
@@ -9175,14 +9175,14 @@
       </w:r>
     </w:p>
     <w:p>
-      <w:bookmarkStart w:id="57306" w:name="kapitel_8"/>
+      <w:bookmarkStart w:id="81387" w:name="kapitel_8"/>
       <w:pPr>
         <w:pStyle w:val="Heading1"/>
       </w:pPr>
       <w:r>
         <w:t>Vier Häuser</w:t>
       </w:r>
-      <w:bookmarkEnd w:id="57306"/>
+      <w:bookmarkEnd w:id="81387"/>
     </w:p>
     <w:p>
       <w:pPr>
@@ -10169,14 +10169,14 @@
       </w:r>
     </w:p>
     <w:p>
-      <w:bookmarkStart w:id="16149" w:name="kapitel_9"/>
+      <w:bookmarkStart w:id="5563" w:name="kapitel_9"/>
       <w:pPr>
         <w:pStyle w:val="Heading1"/>
       </w:pPr>
       <w:r>
         <w:t>Die, die geblieben ist</w:t>
       </w:r>
-      <w:bookmarkEnd w:id="16149"/>
+      <w:bookmarkEnd w:id="5563"/>
     </w:p>
     <w:p>
       <w:pPr>
@@ -11477,14 +11477,14 @@
       </w:r>
     </w:p>
     <w:p>
-      <w:bookmarkStart w:id="53135" w:name="kapitel_10"/>
+      <w:bookmarkStart w:id="54500" w:name="kapitel_10"/>
       <w:pPr>
         <w:pStyle w:val="Heading1"/>
       </w:pPr>
       <w:r>
         <w:t>Waffenstillstand</w:t>
       </w:r>
-      <w:bookmarkEnd w:id="53135"/>
+      <w:bookmarkEnd w:id="54500"/>
     </w:p>
     <w:p>
       <w:pPr>
@@ -12623,14 +12623,14 @@
       </w:r>
     </w:p>
     <w:p>
-      <w:bookmarkStart w:id="35757" w:name="kapitel_11"/>
+      <w:bookmarkStart w:id="34859" w:name="kapitel_11"/>
       <w:pPr>
         <w:pStyle w:val="Heading1"/>
       </w:pPr>
       <w:r>
         <w:t>Das fünfte Haus</w:t>
       </w:r>
-      <w:bookmarkEnd w:id="35757"/>
+      <w:bookmarkEnd w:id="34859"/>
     </w:p>
     <w:p>
       <w:pPr>
@@ -13694,14 +13694,14 @@
       </w:r>
     </w:p>
     <w:p>
-      <w:bookmarkStart w:id="94834" w:name="kapitel_12"/>
+      <w:bookmarkStart w:id="29315" w:name="kapitel_12"/>
       <w:pPr>
         <w:pStyle w:val="Heading1"/>
       </w:pPr>
       <w:r>
         <w:t>Das Andenken</w:t>
       </w:r>
-      <w:bookmarkEnd w:id="94834"/>
+      <w:bookmarkEnd w:id="29315"/>
     </w:p>
     <w:p>
       <w:pPr>
@@ -14859,14 +14859,14 @@
       </w:r>
     </w:p>
     <w:p>
-      <w:bookmarkStart w:id="42281" w:name="kapitel_13"/>
+      <w:bookmarkStart w:id="10194" w:name="kapitel_13"/>
       <w:pPr>
         <w:pStyle w:val="Heading1"/>
       </w:pPr>
       <w:r>
         <w:t>Was ein Pfand ist</w:t>
       </w:r>
-      <w:bookmarkEnd w:id="42281"/>
+      <w:bookmarkEnd w:id="10194"/>
     </w:p>
     <w:p>
       <w:pPr>
@@ -16375,14 +16375,14 @@
       </w:r>
     </w:p>
     <w:p>
-      <w:bookmarkStart w:id="9856" w:name="kapitel_14"/>
+      <w:bookmarkStart w:id="40392" w:name="kapitel_14"/>
       <w:pPr>
         <w:pStyle w:val="Heading1"/>
       </w:pPr>
       <w:r>
         <w:t>Die Mühle</w:t>
       </w:r>
-      <w:bookmarkEnd w:id="9856"/>
+      <w:bookmarkEnd w:id="40392"/>
     </w:p>
     <w:p>
       <w:pPr>
@@ -17653,14 +17653,14 @@
       </w:r>
     </w:p>
     <w:p>
-      <w:bookmarkStart w:id="73822" w:name="kapitel_15"/>
+      <w:bookmarkStart w:id="15608" w:name="kapitel_15"/>
       <w:pPr>
         <w:pStyle w:val="Heading1"/>
       </w:pPr>
       <w:r>
         <w:t>Was Nele wusste</w:t>
       </w:r>
-      <w:bookmarkEnd w:id="73822"/>
+      <w:bookmarkEnd w:id="15608"/>
     </w:p>
     <w:p>
       <w:pPr>
@@ -18888,14 +18888,14 @@
       </w:r>
     </w:p>
     <w:p>
-      <w:bookmarkStart w:id="29187" w:name="kapitel_16"/>
+      <w:bookmarkStart w:id="84898" w:name="kapitel_16"/>
       <w:pPr>
         <w:pStyle w:val="Heading1"/>
       </w:pPr>
       <w:r>
         <w:t>Die Namen auf den Steinen</w:t>
       </w:r>
-      <w:bookmarkEnd w:id="29187"/>
+      <w:bookmarkEnd w:id="84898"/>
     </w:p>
     <w:p>
       <w:pPr>
@@ -20221,14 +20221,14 @@
       </w:r>
     </w:p>
     <w:p>
-      <w:bookmarkStart w:id="64349" w:name="kapitel_17"/>
+      <w:bookmarkStart w:id="61644" w:name="kapitel_17"/>
       <w:pPr>
         <w:pStyle w:val="Heading1"/>
       </w:pPr>
       <w:r>
         <w:t>Der Stein</w:t>
       </w:r>
-      <w:bookmarkEnd w:id="64349"/>
+      <w:bookmarkEnd w:id="61644"/>
     </w:p>
     <w:p>
       <w:pPr>
@@ -21982,14 +21982,14 @@
       </w:r>
     </w:p>
     <w:p>
-      <w:bookmarkStart w:id="70071" w:name="kapitel_18"/>
+      <w:bookmarkStart w:id="89140" w:name="kapitel_18"/>
       <w:pPr>
         <w:pStyle w:val="Heading1"/>
       </w:pPr>
       <w:r>
         <w:t>Was man zurückgibt</w:t>
       </w:r>
-      <w:bookmarkEnd w:id="70071"/>
+      <w:bookmarkEnd w:id="89140"/>
     </w:p>
     <w:p>
       <w:pPr>
@@ -23665,14 +23665,14 @@
       </w:r>
     </w:p>
     <w:p>
-      <w:bookmarkStart w:id="99121" w:name="kapitel_19"/>
+      <w:bookmarkStart w:id="77952" w:name="kapitel_19"/>
       <w:pPr>
         <w:pStyle w:val="Heading1"/>
       </w:pPr>
       <w:r>
         <w:t>Zurück in Eichenhain</w:t>
       </w:r>
-      <w:bookmarkEnd w:id="99121"/>
+      <w:bookmarkEnd w:id="77952"/>
     </w:p>
     <w:p>
       <w:pPr>
@@ -25476,6 +25476,75 @@
           <w:sz w:val="22"/>
         </w:rPr>
         <w:t>Jede Bewertung hilft mir, noch mehr Abenteuer für dich zu schreiben!</w:t>
+      </w:r>
+    </w:p>
+    <w:p/>
+    <w:p>
+      <w:pPr>
+        <w:spacing w:after="160"/>
+        <w:jc w:val="center"/>
+      </w:pPr>
+      <w:r>
+        <w:rPr>
+          <w:rFonts w:ascii="Georgia" w:hAnsi="Georgia"/>
+          <w:i/>
+          <w:sz w:val="22"/>
+        </w:rPr>
+        <w:t>Einfach den Code scannen und eine Bewertung dalassen:</w:t>
+      </w:r>
+    </w:p>
+    <w:p>
+      <w:pPr>
+        <w:spacing w:line="240" w:lineRule="auto" w:before="120" w:after="120"/>
+        <w:jc w:val="center"/>
+      </w:pPr>
+      <w:r>
+        <w:drawing>
+          <wp:inline xmlns:a="http://schemas.openxmlformats.org/drawingml/2006/main" xmlns:pic="http://schemas.openxmlformats.org/drawingml/2006/picture">
+            <wp:extent cx="1371600" cy="1371600"/>
+            <wp:docPr id="1" name="Picture 1"/>
+            <wp:cNvGraphicFramePr>
+              <a:graphicFrameLocks noChangeAspect="1"/>
+            </wp:cNvGraphicFramePr>
+            <a:graphic>
+              <a:graphicData uri="http://schemas.openxmlformats.org/drawingml/2006/picture">
+                <pic:pic>
+                  <pic:nvPicPr>
+                    <pic:cNvPr id="0" name="qr_rezension_band4.png"/>
+                    <pic:cNvPicPr/>
+                  </pic:nvPicPr>
+                  <pic:blipFill>
+                    <a:blip r:embed="rId9"/>
+                    <a:stretch>
+                      <a:fillRect/>
+                    </a:stretch>
+                  </pic:blipFill>
+                  <pic:spPr>
+                    <a:xfrm>
+                      <a:off x="0" y="0"/>
+                      <a:ext cx="1371600" cy="1371600"/>
+                    </a:xfrm>
+                    <a:prstGeom prst="rect"/>
+                  </pic:spPr>
+                </pic:pic>
+              </a:graphicData>
+            </a:graphic>
+          </wp:inline>
+        </w:drawing>
+      </w:r>
+    </w:p>
+    <w:p>
+      <w:pPr>
+        <w:spacing w:after="200"/>
+        <w:jc w:val="center"/>
+      </w:pPr>
+      <w:r>
+        <w:rPr>
+          <w:rFonts w:ascii="Georgia" w:hAnsi="Georgia"/>
+          <w:i/>
+          <w:sz w:val="18"/>
+        </w:rPr>
+        <w:t>(Handykamera auf den Code halten – der Link öffnet sich von selbst.)</w:t>
       </w:r>
     </w:p>
     <w:p/>

</xml_diff>

<commit_message>
Band 4: echte ISBN 9798188627935 im Impressum (Platzhalter ersetzt)
Co-Authored-By: Claude Opus 4.8 <noreply@anthropic.com>
</commit_message>
<xml_diff>
--- a/Band_4/Linear/Manuskript.docx
+++ b/Band_4/Linear/Manuskript.docx
@@ -187,7 +187,7 @@
           <w:rFonts w:ascii="Georgia" w:hAnsi="Georgia"/>
           <w:sz w:val="16"/>
         </w:rPr>
-        <w:t>ISBN: ###ISBN_BAND4###</w:t>
+        <w:t>ISBN: 9798188627935</w:t>
       </w:r>
     </w:p>
     <w:p>
@@ -619,14 +619,14 @@
       </w:r>
     </w:p>
     <w:p>
-      <w:bookmarkStart w:id="8979" w:name="kapitel_1"/>
+      <w:bookmarkStart w:id="6767" w:name="kapitel_1"/>
       <w:pPr>
         <w:pStyle w:val="Heading1"/>
       </w:pPr>
       <w:r>
         <w:t>Der Brief</w:t>
       </w:r>
-      <w:bookmarkEnd w:id="8979"/>
+      <w:bookmarkEnd w:id="6767"/>
     </w:p>
     <w:p>
       <w:pPr>
@@ -1935,14 +1935,14 @@
       </w:r>
     </w:p>
     <w:p>
-      <w:bookmarkStart w:id="60086" w:name="kapitel_2"/>
+      <w:bookmarkStart w:id="87689" w:name="kapitel_2"/>
       <w:pPr>
         <w:pStyle w:val="Heading1"/>
       </w:pPr>
       <w:r>
         <w:t>Der Mann, der vierzig Jahre gesucht hat</w:t>
       </w:r>
-      <w:bookmarkEnd w:id="60086"/>
+      <w:bookmarkEnd w:id="87689"/>
     </w:p>
     <w:p>
       <w:pPr>
@@ -2982,14 +2982,14 @@
       </w:r>
     </w:p>
     <w:p>
-      <w:bookmarkStart w:id="64523" w:name="kapitel_3"/>
+      <w:bookmarkStart w:id="31582" w:name="kapitel_3"/>
       <w:pPr>
         <w:pStyle w:val="Heading1"/>
       </w:pPr>
       <w:r>
         <w:t>Der Graue See</w:t>
       </w:r>
-      <w:bookmarkEnd w:id="64523"/>
+      <w:bookmarkEnd w:id="31582"/>
     </w:p>
     <w:p>
       <w:pPr>
@@ -4335,14 +4335,14 @@
       </w:r>
     </w:p>
     <w:p>
-      <w:bookmarkStart w:id="61829" w:name="kapitel_4"/>
+      <w:bookmarkStart w:id="73604" w:name="kapitel_4"/>
       <w:pPr>
         <w:pStyle w:val="Heading1"/>
       </w:pPr>
       <w:r>
         <w:t>Die erste Regel am See</w:t>
       </w:r>
-      <w:bookmarkEnd w:id="61829"/>
+      <w:bookmarkEnd w:id="73604"/>
     </w:p>
     <w:p>
       <w:pPr>
@@ -5822,14 +5822,14 @@
       </w:r>
     </w:p>
     <w:p>
-      <w:bookmarkStart w:id="61081" w:name="kapitel_5"/>
+      <w:bookmarkStart w:id="66584" w:name="kapitel_5"/>
       <w:pPr>
         <w:pStyle w:val="Heading1"/>
       </w:pPr>
       <w:r>
         <w:t>Drei Wellen und ein Stern</w:t>
       </w:r>
-      <w:bookmarkEnd w:id="61081"/>
+      <w:bookmarkEnd w:id="66584"/>
     </w:p>
     <w:p>
       <w:pPr>
@@ -6944,14 +6944,14 @@
       </w:r>
     </w:p>
     <w:p>
-      <w:bookmarkStart w:id="35320" w:name="kapitel_6"/>
+      <w:bookmarkStart w:id="44092" w:name="kapitel_6"/>
       <w:pPr>
         <w:pStyle w:val="Heading1"/>
       </w:pPr>
       <w:r>
         <w:t>Die Frau, die die Geschichte hütet</w:t>
       </w:r>
-      <w:bookmarkEnd w:id="35320"/>
+      <w:bookmarkEnd w:id="44092"/>
     </w:p>
     <w:p>
       <w:pPr>
@@ -8192,14 +8192,14 @@
       </w:r>
     </w:p>
     <w:p>
-      <w:bookmarkStart w:id="17738" w:name="kapitel_7"/>
+      <w:bookmarkStart w:id="18072" w:name="kapitel_7"/>
       <w:pPr>
         <w:pStyle w:val="Heading1"/>
       </w:pPr>
       <w:r>
         <w:t>Der Weg über den Hang</w:t>
       </w:r>
-      <w:bookmarkEnd w:id="17738"/>
+      <w:bookmarkEnd w:id="18072"/>
     </w:p>
     <w:p>
       <w:pPr>
@@ -9175,14 +9175,14 @@
       </w:r>
     </w:p>
     <w:p>
-      <w:bookmarkStart w:id="81387" w:name="kapitel_8"/>
+      <w:bookmarkStart w:id="34574" w:name="kapitel_8"/>
       <w:pPr>
         <w:pStyle w:val="Heading1"/>
       </w:pPr>
       <w:r>
         <w:t>Vier Häuser</w:t>
       </w:r>
-      <w:bookmarkEnd w:id="81387"/>
+      <w:bookmarkEnd w:id="34574"/>
     </w:p>
     <w:p>
       <w:pPr>
@@ -10169,14 +10169,14 @@
       </w:r>
     </w:p>
     <w:p>
-      <w:bookmarkStart w:id="5563" w:name="kapitel_9"/>
+      <w:bookmarkStart w:id="19710" w:name="kapitel_9"/>
       <w:pPr>
         <w:pStyle w:val="Heading1"/>
       </w:pPr>
       <w:r>
         <w:t>Die, die geblieben ist</w:t>
       </w:r>
-      <w:bookmarkEnd w:id="5563"/>
+      <w:bookmarkEnd w:id="19710"/>
     </w:p>
     <w:p>
       <w:pPr>
@@ -11477,14 +11477,14 @@
       </w:r>
     </w:p>
     <w:p>
-      <w:bookmarkStart w:id="54500" w:name="kapitel_10"/>
+      <w:bookmarkStart w:id="34774" w:name="kapitel_10"/>
       <w:pPr>
         <w:pStyle w:val="Heading1"/>
       </w:pPr>
       <w:r>
         <w:t>Waffenstillstand</w:t>
       </w:r>
-      <w:bookmarkEnd w:id="54500"/>
+      <w:bookmarkEnd w:id="34774"/>
     </w:p>
     <w:p>
       <w:pPr>
@@ -12623,14 +12623,14 @@
       </w:r>
     </w:p>
     <w:p>
-      <w:bookmarkStart w:id="34859" w:name="kapitel_11"/>
+      <w:bookmarkStart w:id="50423" w:name="kapitel_11"/>
       <w:pPr>
         <w:pStyle w:val="Heading1"/>
       </w:pPr>
       <w:r>
         <w:t>Das fünfte Haus</w:t>
       </w:r>
-      <w:bookmarkEnd w:id="34859"/>
+      <w:bookmarkEnd w:id="50423"/>
     </w:p>
     <w:p>
       <w:pPr>
@@ -13694,14 +13694,14 @@
       </w:r>
     </w:p>
     <w:p>
-      <w:bookmarkStart w:id="29315" w:name="kapitel_12"/>
+      <w:bookmarkStart w:id="8429" w:name="kapitel_12"/>
       <w:pPr>
         <w:pStyle w:val="Heading1"/>
       </w:pPr>
       <w:r>
         <w:t>Das Andenken</w:t>
       </w:r>
-      <w:bookmarkEnd w:id="29315"/>
+      <w:bookmarkEnd w:id="8429"/>
     </w:p>
     <w:p>
       <w:pPr>
@@ -14859,14 +14859,14 @@
       </w:r>
     </w:p>
     <w:p>
-      <w:bookmarkStart w:id="10194" w:name="kapitel_13"/>
+      <w:bookmarkStart w:id="56361" w:name="kapitel_13"/>
       <w:pPr>
         <w:pStyle w:val="Heading1"/>
       </w:pPr>
       <w:r>
         <w:t>Was ein Pfand ist</w:t>
       </w:r>
-      <w:bookmarkEnd w:id="10194"/>
+      <w:bookmarkEnd w:id="56361"/>
     </w:p>
     <w:p>
       <w:pPr>
@@ -16375,14 +16375,14 @@
       </w:r>
     </w:p>
     <w:p>
-      <w:bookmarkStart w:id="40392" w:name="kapitel_14"/>
+      <w:bookmarkStart w:id="31326" w:name="kapitel_14"/>
       <w:pPr>
         <w:pStyle w:val="Heading1"/>
       </w:pPr>
       <w:r>
         <w:t>Die Mühle</w:t>
       </w:r>
-      <w:bookmarkEnd w:id="40392"/>
+      <w:bookmarkEnd w:id="31326"/>
     </w:p>
     <w:p>
       <w:pPr>
@@ -17653,14 +17653,14 @@
       </w:r>
     </w:p>
     <w:p>
-      <w:bookmarkStart w:id="15608" w:name="kapitel_15"/>
+      <w:bookmarkStart w:id="10474" w:name="kapitel_15"/>
       <w:pPr>
         <w:pStyle w:val="Heading1"/>
       </w:pPr>
       <w:r>
         <w:t>Was Nele wusste</w:t>
       </w:r>
-      <w:bookmarkEnd w:id="15608"/>
+      <w:bookmarkEnd w:id="10474"/>
     </w:p>
     <w:p>
       <w:pPr>
@@ -18888,14 +18888,14 @@
       </w:r>
     </w:p>
     <w:p>
-      <w:bookmarkStart w:id="84898" w:name="kapitel_16"/>
+      <w:bookmarkStart w:id="75841" w:name="kapitel_16"/>
       <w:pPr>
         <w:pStyle w:val="Heading1"/>
       </w:pPr>
       <w:r>
         <w:t>Die Namen auf den Steinen</w:t>
       </w:r>
-      <w:bookmarkEnd w:id="84898"/>
+      <w:bookmarkEnd w:id="75841"/>
     </w:p>
     <w:p>
       <w:pPr>
@@ -20221,14 +20221,14 @@
       </w:r>
     </w:p>
     <w:p>
-      <w:bookmarkStart w:id="61644" w:name="kapitel_17"/>
+      <w:bookmarkStart w:id="70029" w:name="kapitel_17"/>
       <w:pPr>
         <w:pStyle w:val="Heading1"/>
       </w:pPr>
       <w:r>
         <w:t>Der Stein</w:t>
       </w:r>
-      <w:bookmarkEnd w:id="61644"/>
+      <w:bookmarkEnd w:id="70029"/>
     </w:p>
     <w:p>
       <w:pPr>
@@ -21982,14 +21982,14 @@
       </w:r>
     </w:p>
     <w:p>
-      <w:bookmarkStart w:id="89140" w:name="kapitel_18"/>
+      <w:bookmarkStart w:id="19065" w:name="kapitel_18"/>
       <w:pPr>
         <w:pStyle w:val="Heading1"/>
       </w:pPr>
       <w:r>
         <w:t>Was man zurückgibt</w:t>
       </w:r>
-      <w:bookmarkEnd w:id="89140"/>
+      <w:bookmarkEnd w:id="19065"/>
     </w:p>
     <w:p>
       <w:pPr>
@@ -23665,14 +23665,14 @@
       </w:r>
     </w:p>
     <w:p>
-      <w:bookmarkStart w:id="77952" w:name="kapitel_19"/>
+      <w:bookmarkStart w:id="99536" w:name="kapitel_19"/>
       <w:pPr>
         <w:pStyle w:val="Heading1"/>
       </w:pPr>
       <w:r>
         <w:t>Zurück in Eichenhain</w:t>
       </w:r>
-      <w:bookmarkEnd w:id="77952"/>
+      <w:bookmarkEnd w:id="99536"/>
     </w:p>
     <w:p>
       <w:pPr>

</xml_diff>